<commit_message>
MVP PLOS ONE: Round-13 A1/A2 responses — T0-1 sign/p-value fix (core 4055->2750), T1-1 within-animal paired disclosure, T1-2 union vs consensus, T1-3 test-set scaler fix, F1-F14 + T2-2/T2-3/T2-7 honesty framing; regenerate LODO CSV; rebuild submission pack; 47/47 gate; v1.4.0
</commit_message>
<xml_diff>
--- a/submission_pack/Cover_Letter.docx
+++ b/submission_pack/Cover_Letter.docx
@@ -88,7 +88,7 @@
           <w:i w:val="0"/>
           <w:sz w:val="22"/>
         </w:rPr>
-        <w:t>I submit the original research article above for consideration as a Research Article. This is a purely computational, multi-dataset reanalysis of publicly available transcriptomes that produces new integrative findings and a reproducible benchmark for the chronic postsurgical pain (CPSP) dorsal root ganglion–spinal (DRG–spinal) axis. It is submitted as primary research: the work generates a novel integrative signature, a non-circular translation test, a prospectively specified full-library drug-repurposing screen with reverse controls, and an explicit bootstrap stability assessment—not a review or re-statement of prior results. Throughout, the axis is framed as a nerve-injury-associated response that this meta-analysis does not establish to be CPSP-specific (the nerve-injury signature does not predict the single incision arm; 46.2% vs 47.1%, p = 0.14).</w:t>
+        <w:t>I submit the original research article above for consideration as a Research Article. This is a purely computational, multi-dataset reanalysis of publicly available transcriptomes that produces new integrative findings and a reproducible benchmark for the chronic postsurgical pain (CPSP) dorsal root ganglion–spinal (DRG–spinal) axis. It is submitted as primary research: the work generates a novel integrative signature, a non-circular translation test, a prospectively specified full-library drug-repurposing screen with reverse controls, and an explicit bootstrap stability assessment—not a review or re-statement of prior results. Throughout, the axis is framed as a nerve-injury-associated response that this meta-analysis does not establish to be CPSP-specific (the nerve-injury signature does not predict the single incision arm; 43.3% vs 47.1%, perm_p = 0.0002 — and because the two arms differ in lesion class, this test is non-informative rather than negative).</w:t>
       </w:r>
     </w:p>
     <w:p>
@@ -111,7 +111,7 @@
           <w:i w:val="0"/>
           <w:sz w:val="22"/>
         </w:rPr>
-        <w:t xml:space="preserve"> PLOS ONE's editorial criteria evaluate scientific rigour and reproducibility rather than perceived novelty or impact, and the journal explicitly welcomes transparent negative and null results. This manuscript is built around exactly those principles. (i) The analysis was pre-specified and registered in the public repository before reporting: the repurposing screen was defined as a full-library breadth analysis with reverse positive controls before any enrichment was computed. (ii) Rigour is reported as results, not footnotes: a DerSimonian–Laird random-effects sensitivity analysis shows the core signature shrinks from 4,055 to 1,008 genes (median I² = 38.8%) and that OXPHOS suppression does not survive set-level Benjamini–Hochberg correction under random effects (q = 0.31); a non-circular test demonstrates the nerve-injury signature does </w:t>
+        <w:t xml:space="preserve"> PLOS ONE's editorial criteria evaluate scientific rigour and reproducibility rather than perceived novelty or impact, and the journal explicitly welcomes transparent negative and null results. This manuscript is built around exactly those principles. (i) The analysis was pre-specified and registered in the public repository before reporting: the repurposing screen was defined as a full-library breadth analysis with reverse positive controls before any enrichment was computed. (ii) Rigour is reported as results, not footnotes: a DerSimonian–Laird random-effects sensitivity analysis shows the core signature shrinks from 2,750 to 508 genes (median I² = 41.8%) and that OXPHOS suppression survives set-level Benjamini–Hochberg correction under random effects (q = 0.0022); a non-circular test demonstrates the nerve-injury signature does </w:t>
       </w:r>
       <w:r>
         <w:rPr>
@@ -129,7 +129,7 @@
           <w:i w:val="0"/>
           <w:sz w:val="22"/>
         </w:rPr>
-        <w:t xml:space="preserve"> predict incision direction (46.2% versus 47.1% background; −0.9 pp, permutation p = 0.14); and a bootstrap shows the docking target set is reproducibly recovered as a structurally tractable subset (mean 8.70 of 17 dock-eligible hubs recovered per resample; P(≥3 of 17) = 1.000), while individual hub membership beyond two resampling-stable genes remains candidate-level, so target selection rests on structural tractability applied to a reproducibly recovered set. (iii) The full-library docking of 3,085 FDA drugs against 10 tractable targets yields an honestly negative result—no target clears both the raw/full-library and size-independent filters (ADRA2A Tier-1 AUC 0.618 collapses to 0.532, p = 0.118)—which we report as a methodological boundary rather than a false-positive hit, including a demonstration of how inadequate controls generate double-dipping false positives.</w:t>
+        <w:t xml:space="preserve"> predict incision direction (43.3% versus 47.1% background; −3.7 pp, permutation p = 0.0002); and a bootstrap shows the docking target set is reproducibly recovered as a structurally tractable subset (mean 8.70 of 17 dock-eligible hubs recovered per resample; P(≥3 of 17) = 1.000), while individual hub membership beyond two resampling-stable genes remains candidate-level, so target selection rests on structural tractability applied to a reproducibly recovered set. (iii) The full-library docking of 3,085 FDA drugs against 10 tractable targets yields an honestly negative result—no target clears both the raw/full-library and size-independent filters (ADRA2A Tier-1 AUC 0.618 collapses to 0.532, p = 0.118)—which we report as a methodological boundary rather than a false-positive hit, including a demonstration of how inadequate controls generate double-dipping false positives.</w:t>
       </w:r>
     </w:p>
     <w:p>
@@ -152,7 +152,7 @@
           <w:i w:val="0"/>
           <w:sz w:val="22"/>
         </w:rPr>
-        <w:t xml:space="preserve"> All processed data and analysis code are in the public GitHub repository at https://github.com/yyx-4113/cpsp-drg-spinal-repurposing, released as version v1.3.0 with a MANIFEST.sha256 integrity manifest at submission. No "available on request" statement is used; all underlying primary data are in the public GEO repository. The manuscript includes an Author Summary (optional under PLOS ONE policy), Data Availability, Ethics, Funding, Competing Interests, and Author Contributions statements.</w:t>
+        <w:t xml:space="preserve"> All processed data and analysis code are in the public GitHub repository at https://github.com/yyx-4113/cpsp-drg-spinal-repurposing, released as version v1.4.0 (GitHub release tag v1.4.0). No "available on request" statement is used; all underlying primary data are in the public GEO repository. The manuscript includes an Author Summary (optional under PLOS ONE policy), Data Availability, Ethics, Funding, Competing Interests, and Author Contributions statements.</w:t>
       </w:r>
     </w:p>
     <w:p>

</xml_diff>